<commit_message>
fix: restore meaningful benchmark verdicts under judge failure
Keep failed judges internal to the panel, fall back to deterministic PASS/PARTIAL/FAIL scoring when the panel degrades, and add a rebuild step so published report artifacts reflect the repaired verdict pipeline.

Co-authored-by: Cursor <cursoragent@cursor.com>
</commit_message>
<xml_diff>
--- a/report/AI_Personal_Assistant_Benchmark_Report.docx
+++ b/report/AI_Personal_Assistant_Benchmark_Report.docx
@@ -173,7 +173,7 @@
               <w:rPr>
                 <w:sz w:val="15"/>
               </w:rPr>
-              <w:t>7426 / 40535</w:t>
+              <w:t>8492 / 57159</w:t>
             </w:r>
           </w:p>
         </w:tc>
@@ -191,7 +191,7 @@
               <w:rPr>
                 <w:sz w:val="15"/>
               </w:rPr>
-              <w:t>6674 / 13136</w:t>
+              <w:t>5800 / 15036</w:t>
             </w:r>
           </w:p>
         </w:tc>
@@ -231,7 +231,7 @@
               <w:rPr>
                 <w:sz w:val="15"/>
               </w:rPr>
-              <w:t>$0.00000 / $0.05212</w:t>
+              <w:t>$0.00000 / $0.05568</w:t>
             </w:r>
           </w:p>
         </w:tc>
@@ -250,7 +250,7 @@
               <w:rPr>
                 <w:sz w:val="15"/>
               </w:rPr>
-              <w:t>$0.01352 / $0.01395</w:t>
+              <w:t>$0.01700 / $0.02224</w:t>
             </w:r>
           </w:p>
         </w:tc>
@@ -288,7 +288,7 @@
               <w:rPr>
                 <w:sz w:val="15"/>
               </w:rPr>
-              <w:t>0 / 500 / 0</w:t>
+              <w:t>1 / 69 / 430</w:t>
             </w:r>
           </w:p>
         </w:tc>
@@ -306,7 +306,7 @@
               <w:rPr>
                 <w:sz w:val="15"/>
               </w:rPr>
-              <w:t>0 / 500 / 0</w:t>
+              <w:t>11 / 50 / 439</w:t>
             </w:r>
           </w:p>
         </w:tc>
@@ -346,7 +346,7 @@
               <w:rPr>
                 <w:sz w:val="15"/>
               </w:rPr>
-              <w:t>3.00 / 4.00</w:t>
+              <w:t>2.50 / 1.75</w:t>
             </w:r>
           </w:p>
         </w:tc>
@@ -365,7 +365,7 @@
               <w:rPr>
                 <w:sz w:val="15"/>
               </w:rPr>
-              <w:t>3.00 / 4.00</w:t>
+              <w:t>1.67 / 1.72</w:t>
             </w:r>
           </w:p>
         </w:tc>
@@ -403,7 +403,7 @@
               <w:rPr>
                 <w:sz w:val="15"/>
               </w:rPr>
-              <w:t>1.00 / 0.871</w:t>
+              <w:t>0.98 / 0.876</w:t>
             </w:r>
           </w:p>
         </w:tc>
@@ -421,7 +421,7 @@
               <w:rPr>
                 <w:sz w:val="15"/>
               </w:rPr>
-              <w:t>1.00 / 0.946</w:t>
+              <w:t>0.95 / 0.909</w:t>
             </w:r>
           </w:p>
         </w:tc>

</xml_diff>